<commit_message>
Update today's file: 26????????\26????????\????\????0302.docx
</commit_message>
<xml_diff>
--- a/26年信息化项目资料/26年信息化项目资料/个人台账/个人台账0302.docx
+++ b/26年信息化项目资料/26年信息化项目资料/个人台账/个人台账0302.docx
@@ -2739,26 +2739,418 @@
           <w:rFonts w:hint="eastAsia"/>
           <w:lang w:val="en-US" w:eastAsia="zh-CN"/>
         </w:rPr>
-        <w:t>建敏总，沟通情报院事项、数据中台等</w:t>
-      </w:r>
-    </w:p>
-    <w:p>
-      <w:pPr>
-        <w:rPr>
-          <w:rFonts w:hint="default"/>
-          <w:lang w:val="en-US" w:eastAsia="zh-CN"/>
-        </w:rPr>
-      </w:pPr>
-    </w:p>
-    <w:p>
-      <w:pPr>
-        <w:rPr>
-          <w:rFonts w:hint="default"/>
-          <w:lang w:val="en-US" w:eastAsia="zh-CN"/>
-        </w:rPr>
-      </w:pPr>
+        <w:t>建敏总，沟通情报院事项、数据中台、产业图谱等</w:t>
+      </w:r>
+    </w:p>
+    <w:p>
+      <w:pPr>
+        <w:rPr>
+          <w:rFonts w:hint="eastAsia"/>
+          <w:lang w:val="en-US" w:eastAsia="zh-CN"/>
+        </w:rPr>
+      </w:pPr>
+      <w:r>
+        <w:rPr>
+          <w:rFonts w:hint="eastAsia"/>
+          <w:lang w:val="en-US" w:eastAsia="zh-CN"/>
+        </w:rPr>
+        <w:t>数据校验</w:t>
+      </w:r>
+    </w:p>
+    <w:p>
+      <w:pPr>
+        <w:rPr>
+          <w:rFonts w:hint="eastAsia"/>
+          <w:lang w:val="en-US" w:eastAsia="zh-CN"/>
+        </w:rPr>
+      </w:pPr>
+      <w:r>
+        <w:rPr>
+          <w:rFonts w:hint="eastAsia"/>
+          <w:lang w:val="en-US" w:eastAsia="zh-CN"/>
+        </w:rPr>
+        <w:t>Opc&amp;项目书</w:t>
+      </w:r>
+    </w:p>
+    <w:p>
+      <w:pPr>
+        <w:rPr>
+          <w:rFonts w:hint="eastAsia"/>
+          <w:lang w:val="en-US" w:eastAsia="zh-CN"/>
+        </w:rPr>
+      </w:pPr>
+    </w:p>
+    <w:p>
+      <w:pPr>
+        <w:rPr>
+          <w:rFonts w:hint="eastAsia"/>
+          <w:lang w:val="en-US" w:eastAsia="zh-CN"/>
+        </w:rPr>
+      </w:pPr>
+    </w:p>
+    <w:p>
+      <w:pPr>
+        <w:rPr>
+          <w:rFonts w:hint="eastAsia"/>
+          <w:lang w:val="en-US" w:eastAsia="zh-CN"/>
+        </w:rPr>
+      </w:pPr>
+    </w:p>
+    <w:p>
+      <w:pPr>
+        <w:rPr>
+          <w:rFonts w:hint="eastAsia"/>
+          <w:lang w:val="en-US" w:eastAsia="zh-CN"/>
+        </w:rPr>
+      </w:pPr>
+    </w:p>
+    <w:p>
+      <w:pPr>
+        <w:rPr>
+          <w:rFonts w:hint="eastAsia"/>
+          <w:lang w:val="en-US" w:eastAsia="zh-CN"/>
+        </w:rPr>
+      </w:pPr>
+    </w:p>
+    <w:p>
+      <w:pPr>
+        <w:rPr>
+          <w:rFonts w:hint="default"/>
+          <w:lang w:val="en-US" w:eastAsia="zh-CN"/>
+        </w:rPr>
+      </w:pPr>
+      <w:r>
+        <w:rPr>
+          <w:rFonts w:hint="eastAsia"/>
+          <w:lang w:val="en-US" w:eastAsia="zh-CN"/>
+        </w:rPr>
+        <w:t>0304</w:t>
+      </w:r>
+    </w:p>
+    <w:p>
+      <w:pPr>
+        <w:keepNext w:val="0"/>
+        <w:keepLines w:val="0"/>
+        <w:widowControl/>
+        <w:suppressLineNumbers w:val="0"/>
+        <w:jc w:val="left"/>
+        <w:rPr>
+          <w:rFonts w:hint="eastAsia" w:ascii="仿宋" w:hAnsi="仿宋" w:eastAsia="仿宋" w:cs="仿宋"/>
+          <w:color w:val="000000"/>
+          <w:kern w:val="0"/>
+          <w:sz w:val="24"/>
+          <w:szCs w:val="24"/>
+          <w:lang w:val="en-US" w:eastAsia="zh-CN" w:bidi="ar"/>
+        </w:rPr>
+      </w:pPr>
+      <w:r>
+        <w:rPr>
+          <w:rFonts w:ascii="仿宋" w:hAnsi="仿宋" w:eastAsia="仿宋" w:cs="仿宋"/>
+          <w:color w:val="000000"/>
+          <w:kern w:val="0"/>
+          <w:sz w:val="24"/>
+          <w:szCs w:val="24"/>
+          <w:lang w:val="en-US" w:eastAsia="zh-CN" w:bidi="ar"/>
+        </w:rPr>
+        <w:t>梳理山东项目清单及ERP工时填报指引</w:t>
+      </w:r>
+      <w:r>
+        <w:rPr>
+          <w:rFonts w:hint="eastAsia" w:ascii="仿宋" w:hAnsi="仿宋" w:eastAsia="仿宋" w:cs="仿宋"/>
+          <w:color w:val="000000"/>
+          <w:kern w:val="0"/>
+          <w:sz w:val="24"/>
+          <w:szCs w:val="24"/>
+          <w:lang w:val="en-US" w:eastAsia="zh-CN" w:bidi="ar"/>
+        </w:rPr>
+        <w:t>，覃思华沟通erp使用及项目建立问题。</w:t>
+      </w:r>
+    </w:p>
+    <w:p>
+      <w:pPr>
+        <w:keepNext w:val="0"/>
+        <w:keepLines w:val="0"/>
+        <w:widowControl/>
+        <w:suppressLineNumbers w:val="0"/>
+        <w:jc w:val="left"/>
+        <w:rPr>
+          <w:rFonts w:hint="eastAsia" w:ascii="仿宋" w:hAnsi="仿宋" w:eastAsia="仿宋" w:cs="仿宋"/>
+          <w:color w:val="000000"/>
+          <w:kern w:val="0"/>
+          <w:sz w:val="24"/>
+          <w:szCs w:val="24"/>
+          <w:lang w:val="en-US" w:eastAsia="zh-CN" w:bidi="ar"/>
+        </w:rPr>
+      </w:pPr>
+    </w:p>
+    <w:p>
+      <w:pPr>
+        <w:keepNext w:val="0"/>
+        <w:keepLines w:val="0"/>
+        <w:widowControl/>
+        <w:suppressLineNumbers w:val="0"/>
+        <w:jc w:val="left"/>
+        <w:rPr>
+          <w:rFonts w:hint="default" w:ascii="仿宋" w:hAnsi="仿宋" w:eastAsia="仿宋" w:cs="仿宋"/>
+          <w:color w:val="000000"/>
+          <w:kern w:val="0"/>
+          <w:sz w:val="24"/>
+          <w:szCs w:val="24"/>
+          <w:lang w:val="en-US" w:eastAsia="zh-CN" w:bidi="ar"/>
+        </w:rPr>
+      </w:pPr>
+    </w:p>
+    <w:p>
+      <w:pPr>
+        <w:keepNext w:val="0"/>
+        <w:keepLines w:val="0"/>
+        <w:widowControl/>
+        <w:suppressLineNumbers w:val="0"/>
+        <w:jc w:val="left"/>
+      </w:pPr>
+      <w:r>
+        <w:rPr>
+          <w:rFonts w:ascii="仿宋" w:hAnsi="仿宋" w:eastAsia="仿宋" w:cs="仿宋"/>
+          <w:color w:val="000000"/>
+          <w:kern w:val="0"/>
+          <w:sz w:val="24"/>
+          <w:szCs w:val="24"/>
+          <w:lang w:val="en-US" w:eastAsia="zh-CN" w:bidi="ar"/>
+        </w:rPr>
+        <w:t>与甲方沟通预发布环境部署报备</w:t>
+      </w:r>
+    </w:p>
+    <w:p>
+      <w:pPr>
+        <w:rPr>
+          <w:rFonts w:hint="eastAsia"/>
+          <w:color w:val="FF0000"/>
+          <w:lang w:val="en-US" w:eastAsia="zh-CN"/>
+        </w:rPr>
+      </w:pPr>
+      <w:r>
+        <w:rPr>
+          <w:rFonts w:hint="eastAsia"/>
+          <w:color w:val="FF0000"/>
+          <w:lang w:val="en-US" w:eastAsia="zh-CN"/>
+        </w:rPr>
+        <w:t>建敏总，沟通情报院事项、数据中台、产业图谱、数据项目处理方式等</w:t>
+      </w:r>
+    </w:p>
+    <w:p>
+      <w:pPr>
+        <w:ind w:firstLine="420" w:firstLineChars="0"/>
+        <w:rPr>
+          <w:rFonts w:hint="eastAsia"/>
+          <w:color w:val="FF0000"/>
+          <w:lang w:val="en-US" w:eastAsia="zh-CN"/>
+        </w:rPr>
+      </w:pPr>
+      <w:r>
+        <w:rPr>
+          <w:rFonts w:hint="eastAsia"/>
+          <w:color w:val="FF0000"/>
+          <w:lang w:val="en-US" w:eastAsia="zh-CN"/>
+        </w:rPr>
+        <w:t>科技统计平台、项目全过程管理平台、产业监测&amp;图谱查询（暂无）、业务中台、数据中台</w:t>
+      </w:r>
+    </w:p>
+    <w:p>
+      <w:pPr>
+        <w:ind w:firstLine="420" w:firstLineChars="0"/>
+        <w:rPr>
+          <w:rFonts w:hint="eastAsia"/>
+          <w:color w:val="FF0000"/>
+          <w:lang w:val="en-US" w:eastAsia="zh-CN"/>
+        </w:rPr>
+      </w:pPr>
+      <w:r>
+        <w:rPr>
+          <w:rFonts w:hint="eastAsia"/>
+          <w:color w:val="FF0000"/>
+          <w:lang w:val="en-US" w:eastAsia="zh-CN"/>
+        </w:rPr>
+        <w:t>数据项目、情报院、两项目处理方式沟通</w:t>
+      </w:r>
+    </w:p>
+    <w:p>
+      <w:pPr>
+        <w:ind w:firstLine="420" w:firstLineChars="0"/>
+        <w:rPr>
+          <w:rFonts w:hint="default"/>
+          <w:color w:val="FF0000"/>
+          <w:lang w:val="en-US" w:eastAsia="zh-CN"/>
+        </w:rPr>
+      </w:pPr>
+    </w:p>
+    <w:p>
+      <w:pPr>
+        <w:ind w:firstLine="420" w:firstLineChars="0"/>
+        <w:rPr>
+          <w:rFonts w:hint="default"/>
+          <w:color w:val="FF0000"/>
+          <w:lang w:val="en-US" w:eastAsia="zh-CN"/>
+        </w:rPr>
+      </w:pPr>
+    </w:p>
+    <w:p>
+      <w:pPr>
+        <w:ind w:firstLine="420" w:firstLineChars="0"/>
+        <w:rPr>
+          <w:rFonts w:hint="default"/>
+          <w:color w:val="FF0000"/>
+          <w:lang w:val="en-US" w:eastAsia="zh-CN"/>
+        </w:rPr>
+      </w:pPr>
+    </w:p>
+    <w:p>
+      <w:pPr>
+        <w:rPr>
+          <w:rFonts w:hint="eastAsia"/>
+          <w:color w:val="FF0000"/>
+          <w:lang w:val="en-US" w:eastAsia="zh-CN"/>
+        </w:rPr>
+      </w:pPr>
+    </w:p>
+    <w:p>
+      <w:pPr>
+        <w:rPr>
+          <w:rFonts w:hint="eastAsia"/>
+          <w:lang w:val="en-US" w:eastAsia="zh-CN"/>
+        </w:rPr>
+      </w:pPr>
+      <w:r>
+        <w:rPr>
+          <w:rFonts w:hint="eastAsia"/>
+          <w:lang w:val="en-US" w:eastAsia="zh-CN"/>
+        </w:rPr>
+        <w:t>安全申报书</w:t>
+      </w:r>
+    </w:p>
+    <w:p>
+      <w:pPr>
+        <w:rPr>
+          <w:rFonts w:hint="eastAsia"/>
+          <w:lang w:val="en-US" w:eastAsia="zh-CN"/>
+        </w:rPr>
+      </w:pPr>
+      <w:r>
+        <w:rPr>
+          <w:rFonts w:hint="eastAsia"/>
+          <w:lang w:val="en-US" w:eastAsia="zh-CN"/>
+        </w:rPr>
+        <w:t>Opc运营方案</w:t>
+      </w:r>
+    </w:p>
+    <w:p>
+      <w:pPr>
+        <w:rPr>
+          <w:rFonts w:hint="default"/>
+          <w:lang w:val="en-US" w:eastAsia="zh-CN"/>
+        </w:rPr>
+      </w:pPr>
+      <w:r>
+        <w:rPr>
+          <w:rFonts w:hint="eastAsia"/>
+          <w:lang w:val="en-US" w:eastAsia="zh-CN"/>
+        </w:rPr>
+        <w:t>Openclaw</w:t>
+      </w:r>
+    </w:p>
+    <w:p>
+      <w:pPr>
+        <w:rPr>
+          <w:rFonts w:hint="default"/>
+          <w:lang w:val="en-US" w:eastAsia="zh-CN"/>
+        </w:rPr>
+      </w:pPr>
+      <w:r>
+        <w:rPr>
+          <w:rFonts w:hint="eastAsia"/>
+          <w:lang w:val="en-US" w:eastAsia="zh-CN"/>
+        </w:rPr>
+        <w:t>处理数据校验及“二本书”全文生成的各项事项</w:t>
+      </w:r>
+    </w:p>
+    <w:p>
+      <w:pPr>
+        <w:rPr>
+          <w:rFonts w:hint="eastAsia"/>
+          <w:lang w:val="en-US" w:eastAsia="zh-CN"/>
+        </w:rPr>
+      </w:pPr>
+    </w:p>
+    <w:p>
+      <w:pPr>
+        <w:rPr>
+          <w:rFonts w:hint="eastAsia"/>
+          <w:lang w:val="en-US" w:eastAsia="zh-CN"/>
+        </w:rPr>
+      </w:pPr>
+      <w:r>
+        <w:rPr>
+          <w:rFonts w:hint="eastAsia"/>
+          <w:lang w:val="en-US" w:eastAsia="zh-CN"/>
+        </w:rPr>
+        <w:t>4个面试</w:t>
+      </w:r>
       <w:bookmarkStart w:id="0" w:name="_GoBack"/>
       <w:bookmarkEnd w:id="0"/>
+    </w:p>
+    <w:p>
+      <w:pPr>
+        <w:rPr>
+          <w:rFonts w:hint="default"/>
+          <w:lang w:val="en-US" w:eastAsia="zh-CN"/>
+        </w:rPr>
+      </w:pPr>
+    </w:p>
+    <w:p>
+      <w:pPr>
+        <w:rPr>
+          <w:rFonts w:hint="default"/>
+          <w:lang w:val="en-US" w:eastAsia="zh-CN"/>
+        </w:rPr>
+      </w:pPr>
+    </w:p>
+    <w:p>
+      <w:pPr>
+        <w:rPr>
+          <w:rFonts w:hint="eastAsia"/>
+          <w:lang w:val="en-US" w:eastAsia="zh-CN"/>
+        </w:rPr>
+      </w:pPr>
+      <w:r>
+        <w:rPr>
+          <w:rFonts w:hint="eastAsia"/>
+          <w:lang w:val="en-US" w:eastAsia="zh-CN"/>
+        </w:rPr>
+        <w:t>1001会议室</w:t>
+      </w:r>
+    </w:p>
+    <w:p>
+      <w:pPr>
+        <w:rPr>
+          <w:rFonts w:hint="default"/>
+          <w:lang w:val="en-US" w:eastAsia="zh-CN"/>
+        </w:rPr>
+      </w:pPr>
+    </w:p>
+    <w:p>
+      <w:pPr>
+        <w:rPr>
+          <w:rFonts w:hint="default"/>
+          <w:lang w:val="en-US" w:eastAsia="zh-CN"/>
+        </w:rPr>
+      </w:pPr>
+    </w:p>
+    <w:p>
+      <w:pPr>
+        <w:rPr>
+          <w:rFonts w:hint="default"/>
+          <w:lang w:val="en-US" w:eastAsia="zh-CN"/>
+        </w:rPr>
+      </w:pPr>
     </w:p>
     <w:sectPr>
       <w:pgSz w:w="11900" w:h="16840"/>

</xml_diff>